<commit_message>
documentacion Fase 2 actualizada
</commit_message>
<xml_diff>
--- a/Fase_2/Informe_Avance_Proyecto_APT_Fase_2.docx
+++ b/Fase_2/Informe_Avance_Proyecto_APT_Fase_2.docx
@@ -5271,12 +5271,12 @@
                 <wp:inline distB="114300" distT="114300" distL="114300" distR="114300">
                   <wp:extent cx="2618122" cy="3316287"/>
                   <wp:effectExtent b="0" l="0" r="0" t="0"/>
-                  <wp:docPr id="1" name="image1.png"/>
+                  <wp:docPr id="1" name="image2.png"/>
                   <a:graphic>
                     <a:graphicData uri="http://schemas.openxmlformats.org/drawingml/2006/picture">
                       <pic:pic>
                         <pic:nvPicPr>
-                          <pic:cNvPr id="0" name="image1.png"/>
+                          <pic:cNvPr id="0" name="image2.png"/>
                           <pic:cNvPicPr preferRelativeResize="0"/>
                         </pic:nvPicPr>
                         <pic:blipFill>
@@ -5311,12 +5311,12 @@
                 <wp:inline distB="114300" distT="114300" distL="114300" distR="114300">
                   <wp:extent cx="2693342" cy="3326513"/>
                   <wp:effectExtent b="0" l="0" r="0" t="0"/>
-                  <wp:docPr id="2" name="image2.png"/>
+                  <wp:docPr id="2" name="image1.png"/>
                   <a:graphic>
                     <a:graphicData uri="http://schemas.openxmlformats.org/drawingml/2006/picture">
                       <pic:pic>
                         <pic:nvPicPr>
-                          <pic:cNvPr id="0" name="image2.png"/>
+                          <pic:cNvPr id="0" name="image1.png"/>
                           <pic:cNvPicPr preferRelativeResize="0"/>
                         </pic:nvPicPr>
                         <pic:blipFill>
@@ -5394,12 +5394,12 @@
           <wp:inline distB="114300" distT="114300" distL="114300" distR="114300">
             <wp:extent cx="5943600" cy="2438400"/>
             <wp:effectExtent b="0" l="0" r="0" t="0"/>
-            <wp:docPr id="3" name="image3.png"/>
+            <wp:docPr id="3" name="image4.png"/>
             <a:graphic>
               <a:graphicData uri="http://schemas.openxmlformats.org/drawingml/2006/picture">
                 <pic:pic>
                   <pic:nvPicPr>
-                    <pic:cNvPr id="0" name="image3.png"/>
+                    <pic:cNvPr id="0" name="image4.png"/>
                     <pic:cNvPicPr preferRelativeResize="0"/>
                   </pic:nvPicPr>
                   <pic:blipFill>
@@ -6600,7 +6600,7 @@
           <w:szCs w:val="26"/>
           <w:rtl w:val="0"/>
         </w:rPr>
-        <w:t xml:space="preserve">3. Proyección y Hoja de Ruta para Fase 3 (Cierre de Portafolio)</w:t>
+        <w:t xml:space="preserve">Proyección y Hoja de Ruta para Fase 3 </w:t>
       </w:r>
     </w:p>
     <w:p>
@@ -6828,13 +6828,52 @@
       </w:pPr>
       <w:r>
         <w:rPr>
+          <w:rFonts w:ascii="Arial" w:cs="Arial" w:eastAsia="Arial" w:hAnsi="Arial"/>
+          <w:sz w:val="24"/>
+          <w:szCs w:val="24"/>
+        </w:rPr>
+        <w:drawing>
+          <wp:inline distB="19050" distT="19050" distL="19050" distR="19050">
+            <wp:extent cx="5943600" cy="3149600"/>
+            <wp:effectExtent b="0" l="0" r="0" t="0"/>
+            <wp:docPr id="4" name="image3.png"/>
+            <a:graphic>
+              <a:graphicData uri="http://schemas.openxmlformats.org/drawingml/2006/picture">
+                <pic:pic>
+                  <pic:nvPicPr>
+                    <pic:cNvPr id="0" name="image3.png"/>
+                    <pic:cNvPicPr preferRelativeResize="0"/>
+                  </pic:nvPicPr>
+                  <pic:blipFill>
+                    <a:blip r:embed="rId11"/>
+                    <a:srcRect b="0" l="0" r="0" t="0"/>
+                    <a:stretch>
+                      <a:fillRect/>
+                    </a:stretch>
+                  </pic:blipFill>
+                  <pic:spPr>
+                    <a:xfrm>
+                      <a:off x="0" y="0"/>
+                      <a:ext cx="5943600" cy="3149600"/>
+                    </a:xfrm>
+                    <a:prstGeom prst="rect"/>
+                    <a:ln/>
+                  </pic:spPr>
+                </pic:pic>
+              </a:graphicData>
+            </a:graphic>
+          </wp:inline>
+        </w:drawing>
+      </w:r>
+      <w:r>
+        <w:rPr>
           <w:rtl w:val="0"/>
         </w:rPr>
       </w:r>
     </w:p>
     <w:sectPr>
-      <w:headerReference r:id="rId11" w:type="default"/>
-      <w:footerReference r:id="rId12" w:type="default"/>
+      <w:headerReference r:id="rId12" w:type="default"/>
+      <w:footerReference r:id="rId13" w:type="default"/>
       <w:pgSz w:h="15840" w:w="12240" w:orient="portrait"/>
       <w:pgMar w:bottom="1440" w:top="1440" w:left="1440" w:right="1440" w:header="720" w:footer="720"/>
       <w:pgNumType w:start="1"/>

</xml_diff>